<commit_message>
New translations individual consultation guide.docx (Papiamento)
</commit_message>
<xml_diff>
--- a/translations/plh_facilitator_cw/pap/pap_Individual Consultation Guide.docx
+++ b/translations/plh_facilitator_cw/pap/pap_Individual Consultation Guide.docx
@@ -23,7 +23,7 @@
       <w:bookmarkStart w:colFirst="0" w:colLast="0" w:name="_aahaeg22an18" w:id="1"/>
       <w:bookmarkEnd w:id="1"/>
       <w:r>
-        <w:t xml:space="preserve">Siña tokante e famia, yu i relashon entre mayor/edukadó i yu.</w:t>
+        <w:t xml:space="preserve">Siña tokante e famia, yunan i relashon entre mayor/edukadó i yu.</w:t>
         <w:br w:type="textWrapping"/>
       </w:r>
     </w:p>
@@ -34,7 +34,7 @@
         <w:jc w:val="left"/>
       </w:pPr>
       <w:r>
-        <w:t xml:space="preserve">Bo mester usa konsultanan individual komo un oportunidat pa siña mas tantu ku bo por tokante e sirkunstansianan i retonan di e famia. Esaki ta importante ya ku ora un mayor/edukadó kuminsá kambia e manera ku e ta interkambiá ku e yunan den e kas, e lo afektá tur otro hende i tin bia por forma konflikto. </w:t>
+        <w:t xml:space="preserve">Bo mester usa konsultanan individual komo un oportunidat pa siña mas tantu ku bo por tokante e sirkunstansianan i retonan di e famia. Esaki ta importante pasobra ora un mayor/edukadó kuminsá kambia e manera ku e ta interkambiá ku e yunan den kas, esaki lo afektá tur otro hende i tin bia por forma konflikto. </w:t>
       </w:r>
     </w:p>
     <w:p>
@@ -54,7 +54,7 @@
         <w:jc w:val="left"/>
       </w:pPr>
       <w:r>
-        <w:t xml:space="preserve">E kombersashon aki lo lagá bo komprondé mihó algun di e retonan ku famianan ta eksperensiá na kas. E lo ekipá bo tambe ku informashon ku por ta útil pa yuda mayornan/edukadónan establesé metanan semanal i solushoná asuntunan ku ta surgi ora mayornan/edukadónan ta praktiká abilidatnan nobo na kas.</w:t>
+        <w:t xml:space="preserve">E kombersashon aki lo lagá bo komprondé mihó algun di e retonan ku famianan ta eksperensiá na kas. E lo duná bo tambe informashon ku por ta útil pa yuda mayornan/edukadónan traha metanan semanal i solushoná asuntunan ku ta surgi ora mayornan/edukadónan ta praktiká abilidatnan nobo na kas.</w:t>
       </w:r>
     </w:p>
     <w:p>
@@ -96,7 +96,7 @@
       </w:pPr>
       <w:r>
         <w:br w:type="textWrapping"/>
-        <w:t xml:space="preserve">Pa yuda mayornan/edukadónan pone un meta, ta importante pa bo pidi mayornan/edukadónan pa deskribí nan ekspektativanan tokante e programa. Ora bo ta hasi esaki, yuda nan identifiká un meta spesífiko tokante kon nan lo ke kambia nan relashon ku nan yu òf e komportashon di nan yu. </w:t>
+        <w:t xml:space="preserve">Pa yuda mayornan/edukadónan pone un meta, ta importante pa bo pidi mayornan/edukadónan pa deskribí nan ekspektativanan tokante e programa. Ora bo ta hasi esaki, yuda nan identifiká un meta spesífiko, ku nan lo ke kambia den nan relashon ku nan yu òf e komportashon di nan yu. </w:t>
       </w:r>
     </w:p>
     <w:p>
@@ -148,7 +148,7 @@
       </w:pPr>
       <w:r>
         <w:br w:type="textWrapping"/>
-        <w:t xml:space="preserve">Ta bo trabou pa yuda mayornan/edukadónan deskribí un komportashon mas spesífiko posibel. Lo bo mester usa pregunta pa logra ku nan ta bira mas i mas spesífiko. Nos ta rekomendá pa bo puntra mayornan/edukadónan kiko “ta bon mucha” òf “tin éksito na skol” ta nifiká pa nan. Ademas, si bo eksplorá ki ora, unda i dikon nan lo ke pa e komportashon akí sosodé, lo yuda hasi nan meta mas spesífiko.</w:t>
+        <w:t xml:space="preserve">Ta bo trabou pa yuda mayornan/edukadónan deskribí un komportashon mas spesífiko posibel. Lo bo mester hasi pregunta pa logra ku nan ta bira mas i mas spesífiko. Nos ta rekomendá pa bo puntra mayornan/edukadónan kiko nan ta komprondé bou di “ta bon mucha” òf “tin éksito na skol”. Ademas, si bo puntra nan ki ora, unda i dikon nan lo ke pa e komportashon akí sosodé, bo ta yuda nan hasi e meta mas spesífiko.</w:t>
       </w:r>
     </w:p>
     <w:p>
@@ -221,7 +221,7 @@
         <w:jc w:val="left"/>
       </w:pPr>
       <w:r>
-        <w:t xml:space="preserve">Por ehèmpel, en bes di bisa, “Mi ke pa mi yu stòp di papia palabra mahos ku mi,” mester yuda un mayor/edukadó pa menshoná e komportashon ku e ke mira: “Mi ke pa mi yu usa palabranan amabel ora e ta papia ku mi.” </w:t>
+        <w:t xml:space="preserve">Lo bo mester yuda un mayor/edukadó pa menshoná e komportashon ku e ke mira na un manera positivo. Por ehèmpel, na lugá di bisa, “Mi ke pa mi yu stòp di papia palabra mahos ku mi,” mester bisa “Mi ke pa mi yu usa palabranan amabel ora e ta papia ku mi.” </w:t>
       </w:r>
     </w:p>
     <w:p>
@@ -254,7 +254,7 @@
       <w:bookmarkStart w:colFirst="0" w:colLast="0" w:name="_mxqbr2959pgq" w:id="5"/>
       <w:bookmarkEnd w:id="5"/>
       <w:r>
-        <w:t xml:space="preserve">E meta tambe mester ta realístiko</w:t>
+        <w:t xml:space="preserve">E meta mester ta realístiko tambe</w:t>
       </w:r>
     </w:p>
     <w:p>
@@ -285,7 +285,7 @@
       </w:pPr>
       <w:r>
         <w:br w:type="textWrapping"/>
-        <w:t xml:space="preserve">Por ehèmpel, si un mayor/edukadó bisa ku e ke pa su yu pasa su èksamennan di skol ku éksito na fin di aña, bo por puntr’é ki komportashonnan spesífiko su yu mester hasi pa hasi esei posibel.</w:t>
+        <w:t xml:space="preserve">Por ehèmpel, si un mayor/edukadó bisa ku e ke pa su yu pasa su èksamennan di skol ku éksito na fin di aña, bo por puntr’é ki komportashonnan spesífiko su yu mester hasi pa logra esei.</w:t>
       </w:r>
     </w:p>
     <w:p>
@@ -296,7 +296,7 @@
       </w:pPr>
       <w:r>
         <w:br w:type="textWrapping"/>
-        <w:t xml:space="preserve">Di mes manera, si un mayor/edukadó ke pa su yu di 2 aña por bisti su paña su so mainta, bo mester eksplorá si esei ta un ekspektativa rasonabel i dikon e yu no por bisti su so. Despues bo por yuda e mayor/edukadó identifiká un meta mas realístiko ku lo yuda su yu desaroyá e abilidatnan pa bisti paña su so manera, “Mi lo ke pa mi yu koperá ku mi miéntras mi ta yud’é bisti paña mainta.” </w:t>
+        <w:t xml:space="preserve">Di mes manera, si un mayor/edukadó ke pa su yu di 2 aña por bisti su paña su so mainta, bo mester eksplorá si esei ta un ekspektativa rasonabel i e motibu ku e yu no por bisti su so. Despues bo por yuda e mayor/edukadó identifiká un meta mas realístiko ku lo yuda su yu desaroyá e abilidatnan pa bisti paña su so manera, “Mi lo ke pa mi yu koperá ku mi miéntras mi ta yud’é bisti paña mainta.” </w:t>
       </w:r>
     </w:p>
     <w:p>
@@ -453,7 +453,7 @@
         </w:rPr>
       </w:pPr>
       <w:r>
-        <w:t xml:space="preserve">Ki tipo di sosten bo ta risibí kaba di amigunan i miembronan di famia yegá ku bo por konfia?</w:t>
+        <w:t xml:space="preserve">Ki tipo di sosten bo ta risibí kaba di amigunan i miembronan di famia yegá, ku bo por konfia?</w:t>
       </w:r>
     </w:p>
     <w:p>
@@ -482,7 +482,7 @@
         </w:rPr>
       </w:pPr>
       <w:r>
-        <w:t xml:space="preserve">Si ta implementando e programa komo parti di un estudio: </w:t>
+        <w:t xml:space="preserve">Si ta implementá e programa komo parti di un estudio: </w:t>
       </w:r>
     </w:p>
     <w:p>
@@ -551,7 +551,7 @@
         </w:rPr>
       </w:pPr>
       <w:r>
-        <w:t xml:space="preserve">Pidi e mayor/edukadó pa selektá un yu pa enfoká riba dje durante e programa. E yu akí mester ta entre e edat di 2 pa 17 aña. Si e mayor/edukadó tin mas ku un yu entre e rango di edat akí, e mester selektá e yu ku aworaki e tin e relashon mas difísil kuné òf ku ta dun,é mas reto pa manehá su komportashon. </w:t>
+        <w:t xml:space="preserve">Pidi e mayor/edukadó pa selektá un yu pa enfoká riba dje durante e programa. E yu akí mester ta entre e edat di 2 pa 17 aña. Si e mayor/edukadó tin mas ku un yu entre e rango di edat akí, e mester selektá e yu ku aworaki e tin e relashon mas difísil kuné òf ku ta dun'é mas reto pa manehá su komportashon. </w:t>
       </w:r>
     </w:p>
     <w:p>
@@ -584,7 +584,7 @@
         </w:rPr>
       </w:pPr>
       <w:r>
-        <w:t xml:space="preserve">Bo por sigurá e mayor/edukadó tambe ku e por apliká e abilidatnan ku e ta siña den e programa pa tur e otro muchanan den su famia, pero ku e mester enfoká riba e mucha akí durante e diskushonnan di grupo i práktika na kas.</w:t>
+        <w:t xml:space="preserve">Bo por sigurá e mayor/edukadó tambe ku e por apliká e abilidatnan ku e ta siña den e programa pa tur e otro muchanan den su famia, pero ku e mester enfoká riba e mucha aki durante e diskushonnan di grupo i práktika na kas.</w:t>
       </w:r>
     </w:p>
     <w:p>
@@ -602,7 +602,7 @@
         </w:rPr>
       </w:pPr>
       <w:r>
-        <w:t xml:space="preserve">Kon bida ta na kas ku bo yu?</w:t>
+        <w:t xml:space="preserve">Kon ta bai na kas ku bo yu?</w:t>
       </w:r>
     </w:p>
     <w:p>
@@ -638,7 +638,7 @@
         </w:rPr>
       </w:pPr>
       <w:r>
-        <w:t xml:space="preserve">Kua ta algun reto ku bo ta konfrontá pa manehá e komportashon di bo yu?</w:t>
+        <w:t xml:space="preserve">Kua ta algun reto ku bo ta topa pa manehá e komportashon di bo yu?</w:t>
       </w:r>
     </w:p>
     <w:p>
@@ -653,7 +653,7 @@
         <w:jc w:val="left"/>
       </w:pPr>
       <w:r>
-        <w:t xml:space="preserve">Tin otro retonan ku ta hasié difísil pa ta un mayor/edukadó?</w:t>
+        <w:t xml:space="preserve">Tin otro retonan ku ta hasi difísil pa ta un mayor/edukadó?</w:t>
       </w:r>
     </w:p>
     <w:p>
@@ -789,7 +789,7 @@
         </w:rPr>
       </w:pPr>
       <w:r>
-        <w:t xml:space="preserve">Otro preguntanan teknológiko ku ta relashoná ku partisipá na e programa. Kiko ta e alfabetisashon digital di e partisipante? Partisipantenan sa kon pa habri mensahenan? Kontestá?</w:t>
+        <w:t xml:space="preserve">Otro preguntanan teknológiko ku ta relashoná ku partisipashon na e programa. Kiko ta e alfabetisashon digital di e partisipante? Partisipantenan sa kon pa habri mensahenan? Kontestá?</w:t>
       </w:r>
     </w:p>
     <w:p>

</xml_diff>